<commit_message>
fix: data display on pdf file
</commit_message>
<xml_diff>
--- a/src/templates/medical_record_template.docx
+++ b/src/templates/medical_record_template.docx
@@ -1381,6 +1381,26 @@
       </w:pPr>
       <w:r>
         <w:rPr>
+          <w:rFonts w:ascii="Times New Roman" w:hAnsi="Times New Roman" w:cs="Times New Roman"/>
+        </w:rPr>
+        <w:t>{</w:t>
+      </w:r>
+      <w:r>
+        <w:rPr>
+          <w:rFonts w:ascii="Times New Roman" w:hAnsi="Times New Roman" w:cs="Times New Roman"/>
+          <w:lang w:val="vi-VN"/>
+        </w:rPr>
+        <w:t>{index}}.</w:t>
+      </w:r>
+      <w:r>
+        <w:rPr>
+          <w:rFonts w:ascii="Calibri" w:hAnsi="Calibri" w:cs="Calibri" w:hint="eastAsia"/>
+          <w:lang w:val="vi-VN"/>
+        </w:rPr>
+        <w:t xml:space="preserve"> </w:t>
+      </w:r>
+      <w:r>
+        <w:rPr>
           <w:rFonts w:ascii="Times New Roman" w:eastAsia="Times New Roman" w:hAnsi="Times New Roman" w:cs="Times New Roman"/>
         </w:rPr>
         <w:t>{{medicineName}}</w:t>
@@ -1413,9 +1433,10 @@
         <w:ind w:left="-425" w:right="6"/>
         <w:jc w:val="right"/>
         <w:rPr>
-          <w:rFonts w:ascii="Times New Roman" w:eastAsia="Times New Roman" w:hAnsi="Times New Roman" w:cs="Times New Roman"/>
+          <w:rFonts w:ascii="Calibri" w:hAnsi="Calibri" w:cs="Calibri" w:hint="eastAsia"/>
           <w:i/>
           <w:iCs/>
+          <w:lang w:val="vi-VN"/>
         </w:rPr>
       </w:pPr>
       <w:r>
@@ -1433,8 +1454,44 @@
           <w:iCs/>
         </w:rPr>
         <w:tab/>
-        <w:t>{{usage}}</w:t>
-      </w:r>
+        <w:t>{{usage</w:t>
+      </w:r>
+      <w:r>
+        <w:rPr>
+          <w:rFonts w:ascii="Times New Roman" w:eastAsia="Times New Roman" w:hAnsi="Times New Roman" w:cs="Times New Roman"/>
+          <w:i/>
+          <w:iCs/>
+        </w:rPr>
+        <w:t>}}</w:t>
+      </w:r>
+      <w:r>
+        <w:rPr>
+          <w:rFonts w:ascii="Times New Roman" w:hAnsi="Times New Roman" w:cs="Times New Roman"/>
+          <w:i/>
+          <w:iCs/>
+        </w:rPr>
+        <w:t>{</w:t>
+      </w:r>
+      <w:r>
+        <w:rPr>
+          <w:rFonts w:ascii="Times New Roman" w:hAnsi="Times New Roman" w:cs="Times New Roman"/>
+          <w:i/>
+          <w:iCs/>
+          <w:lang w:val="vi-VN"/>
+        </w:rPr>
+        <w:t>{prepNote}}</w:t>
+      </w:r>
+    </w:p>
+    <w:p>
+      <w:pPr>
+        <w:keepLines/>
+        <w:spacing w:after="120" w:line="240" w:lineRule="auto"/>
+        <w:ind w:left="-425" w:right="6"/>
+        <w:jc w:val="right"/>
+        <w:rPr>
+          <w:rFonts w:ascii="Times New Roman" w:hAnsi="Times New Roman" w:cs="Times New Roman" w:hint="eastAsia"/>
+        </w:rPr>
+      </w:pPr>
     </w:p>
     <w:p>
       <w:pPr>
@@ -1488,7 +1545,6 @@
         <w:rPr>
           <w:rFonts w:ascii="Times New Roman" w:eastAsia="Times New Roman" w:hAnsi="Times New Roman" w:cs="Times New Roman"/>
         </w:rPr>
-        <w:lastRenderedPageBreak/>
         <w:t xml:space="preserve">Ghi chú: </w:t>
       </w:r>
       <w:r>
@@ -1985,7 +2041,7 @@
   <w:docDefaults>
     <w:rPrDefault>
       <w:rPr>
-        <w:rFonts w:ascii="Arial" w:eastAsia="Arial" w:hAnsi="Arial" w:cs="Arial"/>
+        <w:rFonts w:ascii="Arial" w:eastAsiaTheme="minorEastAsia" w:hAnsi="Arial" w:cs="Arial"/>
         <w:sz w:val="22"/>
         <w:szCs w:val="22"/>
         <w:lang w:val="vi" w:eastAsia="ja-JP" w:bidi="ar-SA"/>

</xml_diff>

<commit_message>
fix: full medical record
</commit_message>
<xml_diff>
--- a/src/templates/medical_record_template.docx
+++ b/src/templates/medical_record_template.docx
@@ -23,111 +23,108 @@
           <w:szCs w:val="20"/>
           <w:lang w:val="en-US"/>
         </w:rPr>
-        <w:t>{{</w:t>
-      </w:r>
-      <w:proofErr w:type="spellStart"/>
-      <w:r>
-        <w:rPr>
-          <w:rFonts w:ascii="Times New Roman" w:eastAsia="Times New Roman" w:hAnsi="Times New Roman" w:cs="Times New Roman"/>
-          <w:b/>
-          <w:bCs/>
+        <w:t>{{clinicName}}</w:t>
+      </w:r>
+      <w:r>
+        <w:rPr>
+          <w:rFonts w:ascii="Times New Roman" w:eastAsia="Times New Roman" w:hAnsi="Times New Roman" w:cs="Times New Roman"/>
+          <w:b/>
+          <w:bCs/>
+          <w:sz w:val="20"/>
+          <w:szCs w:val="20"/>
+        </w:rPr>
+        <w:tab/>
+      </w:r>
+      <w:r>
+        <w:rPr>
+          <w:rFonts w:ascii="Times New Roman" w:eastAsia="Times New Roman" w:hAnsi="Times New Roman" w:cs="Times New Roman"/>
+          <w:b/>
+          <w:bCs/>
+          <w:sz w:val="20"/>
+          <w:szCs w:val="20"/>
+        </w:rPr>
+        <w:tab/>
+      </w:r>
+      <w:r>
+        <w:rPr>
+          <w:rFonts w:ascii="Times New Roman" w:eastAsia="Times New Roman" w:hAnsi="Times New Roman" w:cs="Times New Roman"/>
+          <w:b/>
+          <w:bCs/>
+          <w:sz w:val="20"/>
+          <w:szCs w:val="20"/>
+        </w:rPr>
+        <w:tab/>
+      </w:r>
+      <w:r>
+        <w:rPr>
+          <w:rFonts w:ascii="Times New Roman" w:eastAsia="Times New Roman" w:hAnsi="Times New Roman" w:cs="Times New Roman"/>
+          <w:b/>
+          <w:bCs/>
+          <w:sz w:val="20"/>
+          <w:szCs w:val="20"/>
+        </w:rPr>
+        <w:tab/>
+      </w:r>
+      <w:r>
+        <w:rPr>
+          <w:rFonts w:ascii="Times New Roman" w:eastAsia="Times New Roman" w:hAnsi="Times New Roman" w:cs="Times New Roman"/>
+          <w:b/>
+          <w:bCs/>
+          <w:sz w:val="20"/>
+          <w:szCs w:val="20"/>
+        </w:rPr>
+        <w:tab/>
+      </w:r>
+      <w:r>
+        <w:rPr>
+          <w:rFonts w:ascii="Times New Roman" w:eastAsia="Times New Roman" w:hAnsi="Times New Roman" w:cs="Times New Roman"/>
+          <w:b/>
+          <w:bCs/>
+          <w:sz w:val="20"/>
+          <w:szCs w:val="20"/>
+        </w:rPr>
+        <w:tab/>
+      </w:r>
+      <w:r>
+        <w:rPr>
+          <w:rFonts w:ascii="Times New Roman" w:eastAsia="Times New Roman" w:hAnsi="Times New Roman" w:cs="Times New Roman"/>
+          <w:b/>
+          <w:bCs/>
+          <w:sz w:val="20"/>
+          <w:szCs w:val="20"/>
+        </w:rPr>
+        <w:tab/>
+      </w:r>
+      <w:r>
+        <w:rPr>
+          <w:rFonts w:ascii="Times New Roman" w:eastAsia="Times New Roman" w:hAnsi="Times New Roman" w:cs="Times New Roman"/>
+          <w:b/>
+          <w:bCs/>
+          <w:sz w:val="20"/>
+          <w:szCs w:val="20"/>
+        </w:rPr>
+        <w:tab/>
+      </w:r>
+    </w:p>
+    <w:p>
+      <w:pPr>
+        <w:spacing w:after="120" w:line="240" w:lineRule="auto"/>
+        <w:ind w:left="-425" w:right="-436"/>
+        <w:rPr>
+          <w:rFonts w:ascii="Times New Roman" w:eastAsia="Times New Roman" w:hAnsi="Times New Roman" w:cs="Times New Roman"/>
           <w:sz w:val="20"/>
           <w:szCs w:val="20"/>
           <w:lang w:val="en-US"/>
         </w:rPr>
-        <w:t>clinicName</w:t>
-      </w:r>
-      <w:proofErr w:type="spellEnd"/>
-      <w:r>
-        <w:rPr>
-          <w:rFonts w:ascii="Times New Roman" w:eastAsia="Times New Roman" w:hAnsi="Times New Roman" w:cs="Times New Roman"/>
-          <w:b/>
-          <w:bCs/>
+      </w:pPr>
+      <w:r>
+        <w:rPr>
+          <w:rFonts w:ascii="Times New Roman" w:eastAsia="Times New Roman" w:hAnsi="Times New Roman" w:cs="Times New Roman"/>
           <w:sz w:val="20"/>
           <w:szCs w:val="20"/>
           <w:lang w:val="en-US"/>
         </w:rPr>
-        <w:t>}}</w:t>
-      </w:r>
-      <w:r>
-        <w:rPr>
-          <w:rFonts w:ascii="Times New Roman" w:eastAsia="Times New Roman" w:hAnsi="Times New Roman" w:cs="Times New Roman"/>
-          <w:b/>
-          <w:bCs/>
-          <w:sz w:val="20"/>
-          <w:szCs w:val="20"/>
-        </w:rPr>
-        <w:tab/>
-      </w:r>
-      <w:r>
-        <w:rPr>
-          <w:rFonts w:ascii="Times New Roman" w:eastAsia="Times New Roman" w:hAnsi="Times New Roman" w:cs="Times New Roman"/>
-          <w:b/>
-          <w:bCs/>
-          <w:sz w:val="20"/>
-          <w:szCs w:val="20"/>
-        </w:rPr>
-        <w:tab/>
-      </w:r>
-      <w:r>
-        <w:rPr>
-          <w:rFonts w:ascii="Times New Roman" w:eastAsia="Times New Roman" w:hAnsi="Times New Roman" w:cs="Times New Roman"/>
-          <w:b/>
-          <w:bCs/>
-          <w:sz w:val="20"/>
-          <w:szCs w:val="20"/>
-        </w:rPr>
-        <w:tab/>
-      </w:r>
-      <w:r>
-        <w:rPr>
-          <w:rFonts w:ascii="Times New Roman" w:eastAsia="Times New Roman" w:hAnsi="Times New Roman" w:cs="Times New Roman"/>
-          <w:b/>
-          <w:bCs/>
-          <w:sz w:val="20"/>
-          <w:szCs w:val="20"/>
-        </w:rPr>
-        <w:tab/>
-      </w:r>
-      <w:r>
-        <w:rPr>
-          <w:rFonts w:ascii="Times New Roman" w:eastAsia="Times New Roman" w:hAnsi="Times New Roman" w:cs="Times New Roman"/>
-          <w:b/>
-          <w:bCs/>
-          <w:sz w:val="20"/>
-          <w:szCs w:val="20"/>
-        </w:rPr>
-        <w:tab/>
-      </w:r>
-      <w:r>
-        <w:rPr>
-          <w:rFonts w:ascii="Times New Roman" w:eastAsia="Times New Roman" w:hAnsi="Times New Roman" w:cs="Times New Roman"/>
-          <w:b/>
-          <w:bCs/>
-          <w:sz w:val="20"/>
-          <w:szCs w:val="20"/>
-        </w:rPr>
-        <w:tab/>
-      </w:r>
-      <w:r>
-        <w:rPr>
-          <w:rFonts w:ascii="Times New Roman" w:eastAsia="Times New Roman" w:hAnsi="Times New Roman" w:cs="Times New Roman"/>
-          <w:b/>
-          <w:bCs/>
-          <w:sz w:val="20"/>
-          <w:szCs w:val="20"/>
-        </w:rPr>
-        <w:tab/>
-      </w:r>
-      <w:r>
-        <w:rPr>
-          <w:rFonts w:ascii="Times New Roman" w:eastAsia="Times New Roman" w:hAnsi="Times New Roman" w:cs="Times New Roman"/>
-          <w:b/>
-          <w:bCs/>
-          <w:sz w:val="20"/>
-          <w:szCs w:val="20"/>
-        </w:rPr>
-        <w:tab/>
+        <w:t>{{clinicAddress}}</w:t>
       </w:r>
     </w:p>
     <w:p>
@@ -146,11 +143,9 @@
           <w:rFonts w:ascii="Times New Roman" w:eastAsia="Times New Roman" w:hAnsi="Times New Roman" w:cs="Times New Roman"/>
           <w:sz w:val="20"/>
           <w:szCs w:val="20"/>
-          <w:lang w:val="en-US"/>
-        </w:rPr>
-        <w:t>{{</w:t>
-      </w:r>
-      <w:proofErr w:type="spellStart"/>
+        </w:rPr>
+        <w:t xml:space="preserve">SĐT: </w:t>
+      </w:r>
       <w:r>
         <w:rPr>
           <w:rFonts w:ascii="Times New Roman" w:eastAsia="Times New Roman" w:hAnsi="Times New Roman" w:cs="Times New Roman"/>
@@ -158,66 +153,7 @@
           <w:szCs w:val="20"/>
           <w:lang w:val="en-US"/>
         </w:rPr>
-        <w:t>clinicAddress</w:t>
-      </w:r>
-      <w:proofErr w:type="spellEnd"/>
-      <w:r>
-        <w:rPr>
-          <w:rFonts w:ascii="Times New Roman" w:eastAsia="Times New Roman" w:hAnsi="Times New Roman" w:cs="Times New Roman"/>
-          <w:sz w:val="20"/>
-          <w:szCs w:val="20"/>
-          <w:lang w:val="en-US"/>
-        </w:rPr>
-        <w:t>}}</w:t>
-      </w:r>
-    </w:p>
-    <w:p>
-      <w:pPr>
-        <w:spacing w:after="120" w:line="240" w:lineRule="auto"/>
-        <w:ind w:left="-425" w:right="-436"/>
-        <w:rPr>
-          <w:rFonts w:ascii="Times New Roman" w:eastAsia="Times New Roman" w:hAnsi="Times New Roman" w:cs="Times New Roman"/>
-          <w:sz w:val="20"/>
-          <w:szCs w:val="20"/>
-          <w:lang w:val="en-US"/>
-        </w:rPr>
-      </w:pPr>
-      <w:r>
-        <w:rPr>
-          <w:rFonts w:ascii="Times New Roman" w:eastAsia="Times New Roman" w:hAnsi="Times New Roman" w:cs="Times New Roman"/>
-          <w:sz w:val="20"/>
-          <w:szCs w:val="20"/>
-        </w:rPr>
-        <w:t xml:space="preserve">SĐT: </w:t>
-      </w:r>
-      <w:r>
-        <w:rPr>
-          <w:rFonts w:ascii="Times New Roman" w:eastAsia="Times New Roman" w:hAnsi="Times New Roman" w:cs="Times New Roman"/>
-          <w:sz w:val="20"/>
-          <w:szCs w:val="20"/>
-          <w:lang w:val="en-US"/>
-        </w:rPr>
-        <w:t>{{</w:t>
-      </w:r>
-      <w:proofErr w:type="spellStart"/>
-      <w:r>
-        <w:rPr>
-          <w:rFonts w:ascii="Times New Roman" w:eastAsia="Times New Roman" w:hAnsi="Times New Roman" w:cs="Times New Roman"/>
-          <w:sz w:val="20"/>
-          <w:szCs w:val="20"/>
-          <w:lang w:val="en-US"/>
-        </w:rPr>
-        <w:t>clinicPhones</w:t>
-      </w:r>
-      <w:proofErr w:type="spellEnd"/>
-      <w:r>
-        <w:rPr>
-          <w:rFonts w:ascii="Times New Roman" w:eastAsia="Times New Roman" w:hAnsi="Times New Roman" w:cs="Times New Roman"/>
-          <w:sz w:val="20"/>
-          <w:szCs w:val="20"/>
-          <w:lang w:val="en-US"/>
-        </w:rPr>
-        <w:t>}}</w:t>
+        <w:t>{{clinicPhones}}</w:t>
       </w:r>
     </w:p>
     <w:p>
@@ -1040,41 +976,13 @@
           <w:color w:val="000000"/>
         </w:rPr>
       </w:pPr>
-      <w:proofErr w:type="spellStart"/>
       <w:r>
         <w:rPr>
           <w:rFonts w:ascii="Times New Roman" w:eastAsia="Times New Roman" w:hAnsi="Times New Roman" w:cs="Times New Roman"/>
           <w:color w:val="000000"/>
           <w:lang w:val="en-US"/>
         </w:rPr>
-        <w:t>Dị</w:t>
-      </w:r>
-      <w:proofErr w:type="spellEnd"/>
-      <w:r>
-        <w:rPr>
-          <w:rFonts w:ascii="Times New Roman" w:eastAsia="Times New Roman" w:hAnsi="Times New Roman" w:cs="Times New Roman"/>
-          <w:color w:val="000000"/>
-          <w:lang w:val="en-US"/>
-        </w:rPr>
-        <w:t xml:space="preserve"> </w:t>
-      </w:r>
-      <w:proofErr w:type="spellStart"/>
-      <w:r>
-        <w:rPr>
-          <w:rFonts w:ascii="Times New Roman" w:eastAsia="Times New Roman" w:hAnsi="Times New Roman" w:cs="Times New Roman"/>
-          <w:color w:val="000000"/>
-          <w:lang w:val="en-US"/>
-        </w:rPr>
-        <w:t>ứng</w:t>
-      </w:r>
-      <w:proofErr w:type="spellEnd"/>
-      <w:r>
-        <w:rPr>
-          <w:rFonts w:ascii="Times New Roman" w:eastAsia="Times New Roman" w:hAnsi="Times New Roman" w:cs="Times New Roman"/>
-          <w:color w:val="000000"/>
-          <w:lang w:val="en-US"/>
-        </w:rPr>
-        <w:t>:</w:t>
+        <w:t>Dị ứng:</w:t>
       </w:r>
     </w:p>
     <w:p>
@@ -1311,7 +1219,32 @@
         <w:rPr>
           <w:rFonts w:ascii="Times New Roman" w:eastAsia="Times New Roman" w:hAnsi="Times New Roman" w:cs="Times New Roman"/>
         </w:rPr>
-        <w:t>{{valueString}} {{valueNumber}} {{unit}}</w:t>
+        <w:t>{{valueString}} {{valueNumber}} {{</w:t>
+      </w:r>
+      <w:r>
+        <w:rPr>
+          <w:rFonts w:ascii="Times New Roman" w:eastAsia="Times New Roman" w:hAnsi="Times New Roman" w:cs="Times New Roman"/>
+        </w:rPr>
+        <w:t>(</w:t>
+      </w:r>
+      <w:r>
+        <w:rPr>
+          <w:rFonts w:ascii="Times New Roman" w:eastAsia="Times New Roman" w:hAnsi="Times New Roman" w:cs="Times New Roman"/>
+        </w:rPr>
+        <w:t>unit</w:t>
+      </w:r>
+      <w:r>
+        <w:rPr>
+          <w:rFonts w:ascii="Times New Roman" w:eastAsia="Times New Roman" w:hAnsi="Times New Roman" w:cs="Times New Roman"/>
+          <w:lang w:val="en-US"/>
+        </w:rPr>
+        <w:t>)</w:t>
+      </w:r>
+      <w:r>
+        <w:rPr>
+          <w:rFonts w:ascii="Times New Roman" w:eastAsia="Times New Roman" w:hAnsi="Times New Roman" w:cs="Times New Roman"/>
+        </w:rPr>
+        <w:t>}}</w:t>
       </w:r>
       <w:r>
         <w:rPr>
@@ -1715,7 +1648,6 @@
           <w:lang w:val="en-US"/>
         </w:rPr>
       </w:pPr>
-      <w:proofErr w:type="spellStart"/>
       <w:r>
         <w:rPr>
           <w:rFonts w:ascii="Times New Roman" w:eastAsia="Times New Roman" w:hAnsi="Times New Roman" w:cs="Times New Roman"/>
@@ -1723,74 +1655,22 @@
           <w:bCs/>
           <w:lang w:val="en-US"/>
         </w:rPr>
-        <w:t>Hẹn</w:t>
-      </w:r>
-      <w:proofErr w:type="spellEnd"/>
-      <w:r>
-        <w:rPr>
-          <w:rFonts w:ascii="Times New Roman" w:eastAsia="Times New Roman" w:hAnsi="Times New Roman" w:cs="Times New Roman"/>
-          <w:b/>
-          <w:bCs/>
+        <w:t>Hẹn tái khám:</w:t>
+      </w:r>
+      <w:r>
+        <w:rPr>
+          <w:rFonts w:ascii="Times New Roman" w:eastAsia="Times New Roman" w:hAnsi="Times New Roman" w:cs="Times New Roman"/>
           <w:lang w:val="en-US"/>
         </w:rPr>
-        <w:t xml:space="preserve"> </w:t>
-      </w:r>
-      <w:proofErr w:type="spellStart"/>
-      <w:r>
-        <w:rPr>
-          <w:rFonts w:ascii="Times New Roman" w:eastAsia="Times New Roman" w:hAnsi="Times New Roman" w:cs="Times New Roman"/>
-          <w:b/>
-          <w:bCs/>
+        <w:t xml:space="preserve"> {{</w:t>
+      </w:r>
+      <w:r>
+        <w:rPr>
+          <w:rFonts w:ascii="Times New Roman" w:eastAsia="Times New Roman" w:hAnsi="Times New Roman" w:cs="Times New Roman"/>
           <w:lang w:val="en-US"/>
         </w:rPr>
-        <w:t>tái</w:t>
-      </w:r>
-      <w:proofErr w:type="spellEnd"/>
-      <w:r>
-        <w:rPr>
-          <w:rFonts w:ascii="Times New Roman" w:eastAsia="Times New Roman" w:hAnsi="Times New Roman" w:cs="Times New Roman"/>
-          <w:b/>
-          <w:bCs/>
-          <w:lang w:val="en-US"/>
-        </w:rPr>
-        <w:t xml:space="preserve"> </w:t>
-      </w:r>
-      <w:proofErr w:type="spellStart"/>
-      <w:r>
-        <w:rPr>
-          <w:rFonts w:ascii="Times New Roman" w:eastAsia="Times New Roman" w:hAnsi="Times New Roman" w:cs="Times New Roman"/>
-          <w:b/>
-          <w:bCs/>
-          <w:lang w:val="en-US"/>
-        </w:rPr>
-        <w:t>khám</w:t>
-      </w:r>
-      <w:proofErr w:type="spellEnd"/>
-      <w:r>
-        <w:rPr>
-          <w:rFonts w:ascii="Times New Roman" w:eastAsia="Times New Roman" w:hAnsi="Times New Roman" w:cs="Times New Roman"/>
-          <w:b/>
-          <w:bCs/>
-          <w:lang w:val="en-US"/>
-        </w:rPr>
-        <w:t>:</w:t>
-      </w:r>
-      <w:r>
-        <w:rPr>
-          <w:rFonts w:ascii="Times New Roman" w:eastAsia="Times New Roman" w:hAnsi="Times New Roman" w:cs="Times New Roman"/>
-          <w:lang w:val="en-US"/>
-        </w:rPr>
-        <w:t xml:space="preserve"> {{</w:t>
-      </w:r>
-      <w:proofErr w:type="spellStart"/>
-      <w:r>
-        <w:rPr>
-          <w:rFonts w:ascii="Times New Roman" w:eastAsia="Times New Roman" w:hAnsi="Times New Roman" w:cs="Times New Roman"/>
-          <w:lang w:val="en-US"/>
-        </w:rPr>
         <w:t>appointmentDate</w:t>
       </w:r>
-      <w:proofErr w:type="spellEnd"/>
       <w:r>
         <w:rPr>
           <w:rFonts w:ascii="Times New Roman" w:eastAsia="Times New Roman" w:hAnsi="Times New Roman" w:cs="Times New Roman"/>
@@ -1975,27 +1855,7 @@
           <w:bCs/>
           <w:lang w:val="en-US"/>
         </w:rPr>
-        <w:t>{{</w:t>
-      </w:r>
-      <w:proofErr w:type="spellStart"/>
-      <w:r>
-        <w:rPr>
-          <w:rFonts w:ascii="Times New Roman" w:eastAsia="Times New Roman" w:hAnsi="Times New Roman" w:cs="Times New Roman"/>
-          <w:b/>
-          <w:bCs/>
-          <w:lang w:val="en-US"/>
-        </w:rPr>
-        <w:t>doctorName</w:t>
-      </w:r>
-      <w:proofErr w:type="spellEnd"/>
-      <w:r>
-        <w:rPr>
-          <w:rFonts w:ascii="Times New Roman" w:eastAsia="Times New Roman" w:hAnsi="Times New Roman" w:cs="Times New Roman"/>
-          <w:b/>
-          <w:bCs/>
-          <w:lang w:val="en-US"/>
-        </w:rPr>
-        <w:t>}}</w:t>
+        <w:t>{{doctorName}}</w:t>
       </w:r>
     </w:p>
     <w:p>
@@ -2850,6 +2710,7 @@
   <w:style w:type="character" w:default="1" w:styleId="DefaultParagraphFont">
     <w:name w:val="Default Paragraph Font"/>
     <w:uiPriority w:val="1"/>
+    <w:semiHidden/>
     <w:unhideWhenUsed/>
   </w:style>
   <w:style w:type="table" w:default="1" w:styleId="TableNormal">

</xml_diff>

<commit_message>
fix: 3 files templates
</commit_message>
<xml_diff>
--- a/src/templates/medical_record_template.docx
+++ b/src/templates/medical_record_template.docx
@@ -23,7 +23,31 @@
           <w:szCs w:val="20"/>
           <w:lang w:val="en-US"/>
         </w:rPr>
-        <w:t>{{clinicName}}</w:t>
+        <w:t>{{</w:t>
+      </w:r>
+      <w:proofErr w:type="spellStart"/>
+      <w:r>
+        <w:rPr>
+          <w:rFonts w:ascii="Times New Roman" w:eastAsia="Times New Roman" w:hAnsi="Times New Roman" w:cs="Times New Roman"/>
+          <w:b/>
+          <w:bCs/>
+          <w:sz w:val="20"/>
+          <w:szCs w:val="20"/>
+          <w:lang w:val="en-US"/>
+        </w:rPr>
+        <w:t>clinicName</w:t>
+      </w:r>
+      <w:proofErr w:type="spellEnd"/>
+      <w:r>
+        <w:rPr>
+          <w:rFonts w:ascii="Times New Roman" w:eastAsia="Times New Roman" w:hAnsi="Times New Roman" w:cs="Times New Roman"/>
+          <w:b/>
+          <w:bCs/>
+          <w:sz w:val="20"/>
+          <w:szCs w:val="20"/>
+          <w:lang w:val="en-US"/>
+        </w:rPr>
+        <w:t>}}</w:t>
       </w:r>
       <w:r>
         <w:rPr>
@@ -124,7 +148,27 @@
           <w:szCs w:val="20"/>
           <w:lang w:val="en-US"/>
         </w:rPr>
-        <w:t>{{clinicAddress}}</w:t>
+        <w:t>{{</w:t>
+      </w:r>
+      <w:proofErr w:type="spellStart"/>
+      <w:r>
+        <w:rPr>
+          <w:rFonts w:ascii="Times New Roman" w:eastAsia="Times New Roman" w:hAnsi="Times New Roman" w:cs="Times New Roman"/>
+          <w:sz w:val="20"/>
+          <w:szCs w:val="20"/>
+          <w:lang w:val="en-US"/>
+        </w:rPr>
+        <w:t>clinicAddress</w:t>
+      </w:r>
+      <w:proofErr w:type="spellEnd"/>
+      <w:r>
+        <w:rPr>
+          <w:rFonts w:ascii="Times New Roman" w:eastAsia="Times New Roman" w:hAnsi="Times New Roman" w:cs="Times New Roman"/>
+          <w:sz w:val="20"/>
+          <w:szCs w:val="20"/>
+          <w:lang w:val="en-US"/>
+        </w:rPr>
+        <w:t>}}</w:t>
       </w:r>
     </w:p>
     <w:p>
@@ -153,7 +197,27 @@
           <w:szCs w:val="20"/>
           <w:lang w:val="en-US"/>
         </w:rPr>
-        <w:t>{{clinicPhones}}</w:t>
+        <w:t>{{</w:t>
+      </w:r>
+      <w:proofErr w:type="spellStart"/>
+      <w:r>
+        <w:rPr>
+          <w:rFonts w:ascii="Times New Roman" w:eastAsia="Times New Roman" w:hAnsi="Times New Roman" w:cs="Times New Roman"/>
+          <w:sz w:val="20"/>
+          <w:szCs w:val="20"/>
+          <w:lang w:val="en-US"/>
+        </w:rPr>
+        <w:t>clinicPhones</w:t>
+      </w:r>
+      <w:proofErr w:type="spellEnd"/>
+      <w:r>
+        <w:rPr>
+          <w:rFonts w:ascii="Times New Roman" w:eastAsia="Times New Roman" w:hAnsi="Times New Roman" w:cs="Times New Roman"/>
+          <w:sz w:val="20"/>
+          <w:szCs w:val="20"/>
+          <w:lang w:val="en-US"/>
+        </w:rPr>
+        <w:t>}}</w:t>
       </w:r>
     </w:p>
     <w:p>
@@ -976,13 +1040,41 @@
           <w:color w:val="000000"/>
         </w:rPr>
       </w:pPr>
+      <w:proofErr w:type="spellStart"/>
       <w:r>
         <w:rPr>
           <w:rFonts w:ascii="Times New Roman" w:eastAsia="Times New Roman" w:hAnsi="Times New Roman" w:cs="Times New Roman"/>
           <w:color w:val="000000"/>
           <w:lang w:val="en-US"/>
         </w:rPr>
-        <w:t>Dị ứng:</w:t>
+        <w:t>Dị</w:t>
+      </w:r>
+      <w:proofErr w:type="spellEnd"/>
+      <w:r>
+        <w:rPr>
+          <w:rFonts w:ascii="Times New Roman" w:eastAsia="Times New Roman" w:hAnsi="Times New Roman" w:cs="Times New Roman"/>
+          <w:color w:val="000000"/>
+          <w:lang w:val="en-US"/>
+        </w:rPr>
+        <w:t xml:space="preserve"> </w:t>
+      </w:r>
+      <w:proofErr w:type="spellStart"/>
+      <w:r>
+        <w:rPr>
+          <w:rFonts w:ascii="Times New Roman" w:eastAsia="Times New Roman" w:hAnsi="Times New Roman" w:cs="Times New Roman"/>
+          <w:color w:val="000000"/>
+          <w:lang w:val="en-US"/>
+        </w:rPr>
+        <w:t>ứng</w:t>
+      </w:r>
+      <w:proofErr w:type="spellEnd"/>
+      <w:r>
+        <w:rPr>
+          <w:rFonts w:ascii="Times New Roman" w:eastAsia="Times New Roman" w:hAnsi="Times New Roman" w:cs="Times New Roman"/>
+          <w:color w:val="000000"/>
+          <w:lang w:val="en-US"/>
+        </w:rPr>
+        <w:t>:</w:t>
       </w:r>
     </w:p>
     <w:p>
@@ -1594,7 +1686,7 @@
         <w:spacing w:after="120" w:line="240" w:lineRule="auto"/>
         <w:ind w:left="-425" w:right="-436"/>
         <w:rPr>
-          <w:rFonts w:ascii="Times New Roman" w:eastAsia="Times New Roman" w:hAnsi="Times New Roman" w:cs="Times New Roman"/>
+          <w:rFonts w:ascii="Times New Roman" w:hAnsi="Times New Roman" w:cs="Times New Roman"/>
         </w:rPr>
       </w:pPr>
       <w:r>
@@ -1602,6 +1694,43 @@
           <w:rFonts w:ascii="Times New Roman" w:eastAsia="Times New Roman" w:hAnsi="Times New Roman" w:cs="Times New Roman"/>
         </w:rPr>
         <w:t>{{/medicines}}</w:t>
+      </w:r>
+    </w:p>
+    <w:p>
+      <w:pPr>
+        <w:tabs>
+          <w:tab w:val="left" w:pos="127"/>
+          <w:tab w:val="left" w:pos="7371"/>
+          <w:tab w:val="right" w:pos="9000"/>
+          <w:tab w:val="right" w:leader="dot" w:pos="9072"/>
+        </w:tabs>
+        <w:spacing w:after="120" w:line="240" w:lineRule="auto"/>
+        <w:ind w:left="-425" w:right="-436"/>
+        <w:rPr>
+          <w:rFonts w:ascii="Calibri" w:hAnsi="Calibri" w:cs="Calibri" w:hint="eastAsia"/>
+          <w:lang w:val="vi-VN"/>
+        </w:rPr>
+      </w:pPr>
+      <w:r>
+        <w:rPr>
+          <w:rFonts w:ascii="Times New Roman" w:hAnsi="Times New Roman" w:cs="Times New Roman"/>
+          <w:lang w:val="vi-VN"/>
+        </w:rPr>
+        <w:t>{{</w:t>
+      </w:r>
+      <w:r>
+        <w:rPr>
+          <w:rFonts w:ascii="Times New Roman" w:hAnsi="Times New Roman" w:cs="Times New Roman" w:hint="eastAsia"/>
+          <w:lang w:val="vi-VN"/>
+        </w:rPr>
+        <w:t>#hasFollowUp</w:t>
+      </w:r>
+      <w:r>
+        <w:rPr>
+          <w:rFonts w:ascii="Times New Roman" w:hAnsi="Times New Roman" w:cs="Times New Roman"/>
+          <w:lang w:val="vi-VN"/>
+        </w:rPr>
+        <w:t>}}</w:t>
       </w:r>
     </w:p>
     <w:p>
@@ -1613,37 +1742,83 @@
         <w:spacing w:after="120" w:line="240" w:lineRule="auto"/>
         <w:ind w:left="-425" w:right="-436"/>
         <w:rPr>
-          <w:rFonts w:ascii="Times New Roman" w:eastAsia="Times New Roman" w:hAnsi="Times New Roman" w:cs="Times New Roman"/>
-          <w:lang w:val="en-US"/>
-        </w:rPr>
-      </w:pPr>
-      <w:r>
-        <w:rPr>
-          <w:rFonts w:ascii="Times New Roman" w:eastAsia="Times New Roman" w:hAnsi="Times New Roman" w:cs="Times New Roman"/>
-          <w:b/>
-          <w:bCs/>
-          <w:lang w:val="en-US"/>
+          <w:rFonts w:ascii="Calibri" w:hAnsi="Calibri" w:cs="Calibri" w:hint="eastAsia"/>
+          <w:b/>
+          <w:bCs/>
+          <w:lang w:val="vi-VN"/>
+        </w:rPr>
+      </w:pPr>
+      <w:r>
+        <w:rPr>
+          <w:rFonts w:ascii="Times New Roman" w:eastAsia="Times New Roman" w:hAnsi="Times New Roman" w:cs="Times New Roman"/>
+          <w:b/>
+          <w:bCs/>
         </w:rPr>
         <w:t>Hẹn tái khám:</w:t>
       </w:r>
       <w:r>
         <w:rPr>
           <w:rFonts w:ascii="Times New Roman" w:eastAsia="Times New Roman" w:hAnsi="Times New Roman" w:cs="Times New Roman"/>
-          <w:lang w:val="en-US"/>
-        </w:rPr>
-        <w:t xml:space="preserve"> {{</w:t>
-      </w:r>
-      <w:r>
-        <w:rPr>
-          <w:rFonts w:ascii="Times New Roman" w:eastAsia="Times New Roman" w:hAnsi="Times New Roman" w:cs="Times New Roman"/>
-          <w:lang w:val="en-US"/>
-        </w:rPr>
-        <w:t>appointmentDate</w:t>
-      </w:r>
-      <w:r>
-        <w:rPr>
-          <w:rFonts w:ascii="Times New Roman" w:eastAsia="Times New Roman" w:hAnsi="Times New Roman" w:cs="Times New Roman"/>
-          <w:lang w:val="en-US"/>
+        </w:rPr>
+        <w:t xml:space="preserve"> {{appointmentDate}}</w:t>
+      </w:r>
+      <w:r>
+        <w:rPr>
+          <w:rFonts w:ascii="Times New Roman" w:hAnsi="Times New Roman" w:cs="Times New Roman" w:hint="eastAsia"/>
+        </w:rPr>
+        <w:t xml:space="preserve">, </w:t>
+      </w:r>
+      <w:r>
+        <w:rPr>
+          <w:rFonts w:ascii="Times New Roman" w:hAnsi="Times New Roman" w:cs="Times New Roman"/>
+          <w:b/>
+          <w:bCs/>
+        </w:rPr>
+        <w:t xml:space="preserve">buổi </w:t>
+      </w:r>
+      <w:r>
+        <w:rPr>
+          <w:rFonts w:ascii="Times New Roman" w:hAnsi="Times New Roman" w:cs="Times New Roman"/>
+          <w:b/>
+          <w:bCs/>
+          <w:lang w:val="vi-VN"/>
+        </w:rPr>
+        <w:t>{{appointmentSession}}</w:t>
+      </w:r>
+    </w:p>
+    <w:p>
+      <w:pPr>
+        <w:tabs>
+          <w:tab w:val="left" w:pos="127"/>
+          <w:tab w:val="left" w:pos="7371"/>
+          <w:tab w:val="right" w:pos="9000"/>
+          <w:tab w:val="right" w:leader="dot" w:pos="9072"/>
+        </w:tabs>
+        <w:spacing w:after="120" w:line="240" w:lineRule="auto"/>
+        <w:ind w:left="-425" w:right="-436"/>
+        <w:rPr>
+          <w:rFonts w:ascii="Calibri" w:hAnsi="Calibri" w:cs="Calibri" w:hint="eastAsia"/>
+          <w:lang w:val="vi-VN"/>
+        </w:rPr>
+      </w:pPr>
+      <w:r>
+        <w:rPr>
+          <w:rFonts w:ascii="Times New Roman" w:hAnsi="Times New Roman" w:cs="Times New Roman"/>
+          <w:lang w:val="vi-VN"/>
+        </w:rPr>
+        <w:t>{{</w:t>
+      </w:r>
+      <w:r>
+        <w:rPr>
+          <w:rFonts w:ascii="Times New Roman" w:hAnsi="Times New Roman" w:cs="Times New Roman" w:hint="eastAsia"/>
+          <w:lang w:val="vi-VN"/>
+        </w:rPr>
+        <w:t>/hasFollowUp</w:t>
+      </w:r>
+      <w:r>
+        <w:rPr>
+          <w:rFonts w:ascii="Times New Roman" w:hAnsi="Times New Roman" w:cs="Times New Roman"/>
+          <w:lang w:val="vi-VN"/>
         </w:rPr>
         <w:t>}}</w:t>
       </w:r>
@@ -1806,7 +1981,6 @@
           <w:rFonts w:ascii="Times New Roman" w:eastAsia="Times New Roman" w:hAnsi="Times New Roman" w:cs="Times New Roman"/>
           <w:b/>
           <w:bCs/>
-          <w:lang w:val="en-US"/>
         </w:rPr>
       </w:pPr>
       <w:r>
@@ -1822,7 +1996,6 @@
           <w:rFonts w:ascii="Times New Roman" w:eastAsia="Times New Roman" w:hAnsi="Times New Roman" w:cs="Times New Roman"/>
           <w:b/>
           <w:bCs/>
-          <w:lang w:val="en-US"/>
         </w:rPr>
         <w:t>{{doctorName}}</w:t>
       </w:r>

</xml_diff>